<commit_message>
upd csv in batch
</commit_message>
<xml_diff>
--- a/udp_protocol.docx
+++ b/udp_protocol.docx
@@ -83,8 +83,9 @@
           <w:rFonts w:ascii="Arial" w:hAnsi="Arial"/>
           <w:b w:val="0"/>
           <w:sz w:val="20"/>
+          <w:lang w:val="ru-RU"/>
         </w:rPr>
-        <w:t xml:space="preserve">Система SeaV</w:t>
+        <w:t xml:space="preserve">Модуль </w:t>
       </w:r>
       <w:r>
         <w:rPr>
@@ -92,7 +93,17 @@
           <w:b w:val="0"/>
           <w:sz w:val="20"/>
         </w:rPr>
-        <w:t xml:space="preserve">ision передаёт результаты обработки по протоколу UDP (unicast, порт 4000). Каждый пакет имеет фиксированный размер 1412 байт и отправляется один раз по завершении очередного цикла расчёта (</w:t>
+        <w:t xml:space="preserve">SeaV</w:t>
+      </w:r>
+      <w:r>
+        <w:rPr>
+          <w:rFonts w:ascii="Arial" w:hAnsi="Arial"/>
+          <w:b w:val="0"/>
+          <w:sz w:val="20"/>
+        </w:rPr>
+        <w:t xml:space="preserve">ision передаёт результаты обработки по протоколу UDP (unicast, порт 4000).</w:t>
+        <w:br/>
+        <w:t xml:space="preserve">Каждый пакет имеет фиксированный размер 1412 байт и отправляется один раз по завершении очередного цикла расчёта (</w:t>
       </w:r>
       <w:r>
         <w:rPr>
@@ -109,7 +120,7 @@
           <w:b w:val="0"/>
           <w:sz w:val="20"/>
         </w:rPr>
-        <w:t xml:space="preserve">каждые 32 оборота антенны, примерно раз в 80 секунд при 25 об/мин).</w:t>
+        <w:t xml:space="preserve">каждые 32 оборота антенны, примерно раз в 80 сек при 25 об/мин).</w:t>
       </w:r>
       <w:r/>
     </w:p>
@@ -1057,11 +1068,11 @@
         <w:gridCol w:w="798"/>
         <w:gridCol w:w="444"/>
         <w:gridCol w:w="1134"/>
-        <w:gridCol w:w="1843"/>
+        <w:gridCol w:w="1417"/>
+        <w:gridCol w:w="992"/>
+        <w:gridCol w:w="1134"/>
         <w:gridCol w:w="850"/>
-        <w:gridCol w:w="992"/>
-        <w:gridCol w:w="850"/>
-        <w:gridCol w:w="2994"/>
+        <w:gridCol w:w="3135"/>
       </w:tblGrid>
       <w:tr>
         <w:trPr/>
@@ -1087,7 +1098,7 @@
                 <w:b/>
                 <w:sz w:val="18"/>
               </w:rPr>
-              <w:t xml:space="preserve">Байты</w:t>
+              <w:t xml:space="preserve">Байт</w:t>
             </w:r>
             <w:r/>
           </w:p>
@@ -1150,7 +1161,7 @@
           <w:tcPr>
             <w:shd w:val="clear" w:color="auto" w:fill="bdd7ee"/>
             <w:tcBorders/>
-            <w:tcW w:w="1843" w:type="dxa"/>
+            <w:tcW w:w="1417" w:type="dxa"/>
             <w:textDirection w:val="lrTb"/>
             <w:noWrap w:val="false"/>
           </w:tcPr>
@@ -1177,7 +1188,7 @@
           <w:tcPr>
             <w:shd w:val="clear" w:color="auto" w:fill="bdd7ee"/>
             <w:tcBorders/>
-            <w:tcW w:w="850" w:type="dxa"/>
+            <w:tcW w:w="992" w:type="dxa"/>
             <w:textDirection w:val="lrTb"/>
             <w:noWrap w:val="false"/>
           </w:tcPr>
@@ -1204,7 +1215,7 @@
           <w:tcPr>
             <w:shd w:val="clear" w:color="auto" w:fill="bdd7ee"/>
             <w:tcBorders/>
-            <w:tcW w:w="992" w:type="dxa"/>
+            <w:tcW w:w="1134" w:type="dxa"/>
             <w:textDirection w:val="lrTb"/>
             <w:noWrap w:val="false"/>
           </w:tcPr>
@@ -1248,8 +1259,9 @@
                 <w:rFonts w:ascii="Arial" w:hAnsi="Arial"/>
                 <w:b/>
                 <w:sz w:val="18"/>
+                <w:lang w:val="ru-RU"/>
               </w:rPr>
-              <w:t xml:space="preserve">Расшифровка</w:t>
+              <w:t xml:space="preserve">Знаменатель</w:t>
             </w:r>
             <w:r/>
           </w:p>
@@ -1258,7 +1270,7 @@
           <w:tcPr>
             <w:shd w:val="clear" w:color="auto" w:fill="bdd7ee"/>
             <w:tcBorders/>
-            <w:tcW w:w="2994" w:type="dxa"/>
+            <w:tcW w:w="3135" w:type="dxa"/>
             <w:textDirection w:val="lrTb"/>
             <w:noWrap w:val="false"/>
           </w:tcPr>
@@ -1362,7 +1374,7 @@
         <w:tc>
           <w:tcPr>
             <w:tcBorders/>
-            <w:tcW w:w="1843" w:type="dxa"/>
+            <w:tcW w:w="1417" w:type="dxa"/>
             <w:textDirection w:val="lrTb"/>
             <w:noWrap w:val="false"/>
           </w:tcPr>
@@ -1387,7 +1399,7 @@
         <w:tc>
           <w:tcPr>
             <w:tcBorders/>
-            <w:tcW w:w="850" w:type="dxa"/>
+            <w:tcW w:w="992" w:type="dxa"/>
             <w:textDirection w:val="lrTb"/>
             <w:noWrap w:val="false"/>
           </w:tcPr>
@@ -1412,7 +1424,7 @@
         <w:tc>
           <w:tcPr>
             <w:tcBorders/>
-            <w:tcW w:w="992" w:type="dxa"/>
+            <w:tcW w:w="1134" w:type="dxa"/>
             <w:textDirection w:val="lrTb"/>
             <w:noWrap w:val="false"/>
           </w:tcPr>
@@ -1462,7 +1474,7 @@
         <w:tc>
           <w:tcPr>
             <w:tcBorders/>
-            <w:tcW w:w="2994" w:type="dxa"/>
+            <w:tcW w:w="3135" w:type="dxa"/>
             <w:textDirection w:val="lrTb"/>
             <w:noWrap w:val="false"/>
           </w:tcPr>
@@ -1569,7 +1581,7 @@
           <w:tcPr>
             <w:shd w:val="clear" w:color="auto" w:fill="f2f2f2"/>
             <w:tcBorders/>
-            <w:tcW w:w="1843" w:type="dxa"/>
+            <w:tcW w:w="1417" w:type="dxa"/>
             <w:textDirection w:val="lrTb"/>
             <w:noWrap w:val="false"/>
           </w:tcPr>
@@ -1595,7 +1607,7 @@
           <w:tcPr>
             <w:shd w:val="clear" w:color="auto" w:fill="f2f2f2"/>
             <w:tcBorders/>
-            <w:tcW w:w="850" w:type="dxa"/>
+            <w:tcW w:w="992" w:type="dxa"/>
             <w:textDirection w:val="lrTb"/>
             <w:noWrap w:val="false"/>
           </w:tcPr>
@@ -1621,7 +1633,7 @@
           <w:tcPr>
             <w:shd w:val="clear" w:color="auto" w:fill="f2f2f2"/>
             <w:tcBorders/>
-            <w:tcW w:w="992" w:type="dxa"/>
+            <w:tcW w:w="1134" w:type="dxa"/>
             <w:textDirection w:val="lrTb"/>
             <w:noWrap w:val="false"/>
           </w:tcPr>
@@ -1673,7 +1685,7 @@
           <w:tcPr>
             <w:shd w:val="clear" w:color="auto" w:fill="f2f2f2"/>
             <w:tcBorders/>
-            <w:tcW w:w="2994" w:type="dxa"/>
+            <w:tcW w:w="3135" w:type="dxa"/>
             <w:textDirection w:val="lrTb"/>
             <w:noWrap w:val="false"/>
           </w:tcPr>
@@ -1838,7 +1850,7 @@
         <w:tc>
           <w:tcPr>
             <w:tcBorders/>
-            <w:tcW w:w="1843" w:type="dxa"/>
+            <w:tcW w:w="1417" w:type="dxa"/>
             <w:textDirection w:val="lrTb"/>
             <w:noWrap w:val="false"/>
           </w:tcPr>
@@ -1863,7 +1875,7 @@
         <w:tc>
           <w:tcPr>
             <w:tcBorders/>
-            <w:tcW w:w="850" w:type="dxa"/>
+            <w:tcW w:w="992" w:type="dxa"/>
             <w:textDirection w:val="lrTb"/>
             <w:noWrap w:val="false"/>
           </w:tcPr>
@@ -1888,7 +1900,7 @@
         <w:tc>
           <w:tcPr>
             <w:tcBorders/>
-            <w:tcW w:w="992" w:type="dxa"/>
+            <w:tcW w:w="1134" w:type="dxa"/>
             <w:textDirection w:val="lrTb"/>
             <w:noWrap w:val="false"/>
           </w:tcPr>
@@ -1938,7 +1950,7 @@
         <w:tc>
           <w:tcPr>
             <w:tcBorders/>
-            <w:tcW w:w="2994" w:type="dxa"/>
+            <w:tcW w:w="3135" w:type="dxa"/>
             <w:textDirection w:val="lrTb"/>
             <w:noWrap w:val="false"/>
           </w:tcPr>
@@ -2045,7 +2057,7 @@
           <w:tcPr>
             <w:shd w:val="clear" w:color="auto" w:fill="f2f2f2"/>
             <w:tcBorders/>
-            <w:tcW w:w="1843" w:type="dxa"/>
+            <w:tcW w:w="1417" w:type="dxa"/>
             <w:textDirection w:val="lrTb"/>
             <w:noWrap w:val="false"/>
           </w:tcPr>
@@ -2071,7 +2083,7 @@
           <w:tcPr>
             <w:shd w:val="clear" w:color="auto" w:fill="f2f2f2"/>
             <w:tcBorders/>
-            <w:tcW w:w="850" w:type="dxa"/>
+            <w:tcW w:w="992" w:type="dxa"/>
             <w:textDirection w:val="lrTb"/>
             <w:noWrap w:val="false"/>
           </w:tcPr>
@@ -2097,7 +2109,7 @@
           <w:tcPr>
             <w:shd w:val="clear" w:color="auto" w:fill="f2f2f2"/>
             <w:tcBorders/>
-            <w:tcW w:w="992" w:type="dxa"/>
+            <w:tcW w:w="1134" w:type="dxa"/>
             <w:textDirection w:val="lrTb"/>
             <w:noWrap w:val="false"/>
           </w:tcPr>
@@ -2149,7 +2161,7 @@
           <w:tcPr>
             <w:shd w:val="clear" w:color="auto" w:fill="f2f2f2"/>
             <w:tcBorders/>
-            <w:tcW w:w="2994" w:type="dxa"/>
+            <w:tcW w:w="3135" w:type="dxa"/>
             <w:textDirection w:val="lrTb"/>
             <w:noWrap w:val="false"/>
           </w:tcPr>
@@ -2269,7 +2281,7 @@
         <w:tc>
           <w:tcPr>
             <w:tcBorders/>
-            <w:tcW w:w="1843" w:type="dxa"/>
+            <w:tcW w:w="1417" w:type="dxa"/>
             <w:textDirection w:val="lrTb"/>
             <w:noWrap w:val="false"/>
           </w:tcPr>
@@ -2302,7 +2314,7 @@
         <w:tc>
           <w:tcPr>
             <w:tcBorders/>
-            <w:tcW w:w="850" w:type="dxa"/>
+            <w:tcW w:w="992" w:type="dxa"/>
             <w:textDirection w:val="lrTb"/>
             <w:noWrap w:val="false"/>
           </w:tcPr>
@@ -2327,7 +2339,7 @@
         <w:tc>
           <w:tcPr>
             <w:tcBorders/>
-            <w:tcW w:w="992" w:type="dxa"/>
+            <w:tcW w:w="1134" w:type="dxa"/>
             <w:textDirection w:val="lrTb"/>
             <w:noWrap w:val="false"/>
           </w:tcPr>
@@ -2377,7 +2389,7 @@
         <w:tc>
           <w:tcPr>
             <w:tcBorders/>
-            <w:tcW w:w="2994" w:type="dxa"/>
+            <w:tcW w:w="3135" w:type="dxa"/>
             <w:textDirection w:val="lrTb"/>
             <w:noWrap w:val="false"/>
           </w:tcPr>
@@ -2484,7 +2496,7 @@
           <w:tcPr>
             <w:shd w:val="clear" w:color="auto" w:fill="f2f2f2"/>
             <w:tcBorders/>
-            <w:tcW w:w="1843" w:type="dxa"/>
+            <w:tcW w:w="1417" w:type="dxa"/>
             <w:textDirection w:val="lrTb"/>
             <w:noWrap w:val="false"/>
           </w:tcPr>
@@ -2501,7 +2513,33 @@
                 <w:b w:val="0"/>
                 <w:sz w:val="18"/>
               </w:rPr>
-              <w:t xml:space="preserve">Tp суммарный — пиковый период</w:t>
+              <w:t xml:space="preserve">Tp сумм</w:t>
+            </w:r>
+            <w:r>
+              <w:rPr>
+                <w:rFonts w:ascii="Arial" w:hAnsi="Arial"/>
+                <w:b w:val="0"/>
+                <w:sz w:val="18"/>
+                <w:lang w:val="ru-RU"/>
+              </w:rPr>
+              <w:t xml:space="preserve">арный</w:t>
+            </w:r>
+            <w:r>
+              <w:rPr>
+                <w:rFonts w:ascii="Arial" w:hAnsi="Arial"/>
+                <w:b w:val="0"/>
+                <w:sz w:val="18"/>
+                <w:lang w:val="ru-RU"/>
+              </w:rPr>
+              <w:t xml:space="preserve"> </w:t>
+            </w:r>
+            <w:r>
+              <w:rPr>
+                <w:rFonts w:ascii="Arial" w:hAnsi="Arial"/>
+                <w:b w:val="0"/>
+                <w:sz w:val="18"/>
+              </w:rPr>
+              <w:t xml:space="preserve">пиковый период</w:t>
             </w:r>
             <w:r/>
           </w:p>
@@ -2510,7 +2548,7 @@
           <w:tcPr>
             <w:shd w:val="clear" w:color="auto" w:fill="f2f2f2"/>
             <w:tcBorders/>
-            <w:tcW w:w="850" w:type="dxa"/>
+            <w:tcW w:w="992" w:type="dxa"/>
             <w:textDirection w:val="lrTb"/>
             <w:noWrap w:val="false"/>
           </w:tcPr>
@@ -2536,7 +2574,7 @@
           <w:tcPr>
             <w:shd w:val="clear" w:color="auto" w:fill="f2f2f2"/>
             <w:tcBorders/>
-            <w:tcW w:w="992" w:type="dxa"/>
+            <w:tcW w:w="1134" w:type="dxa"/>
             <w:textDirection w:val="lrTb"/>
             <w:noWrap w:val="false"/>
           </w:tcPr>
@@ -2588,7 +2626,7 @@
           <w:tcPr>
             <w:shd w:val="clear" w:color="auto" w:fill="f2f2f2"/>
             <w:tcBorders/>
-            <w:tcW w:w="2994" w:type="dxa"/>
+            <w:tcW w:w="3135" w:type="dxa"/>
             <w:textDirection w:val="lrTb"/>
             <w:noWrap w:val="false"/>
           </w:tcPr>
@@ -2691,7 +2729,7 @@
         <w:tc>
           <w:tcPr>
             <w:tcBorders/>
-            <w:tcW w:w="1843" w:type="dxa"/>
+            <w:tcW w:w="1417" w:type="dxa"/>
             <w:textDirection w:val="lrTb"/>
             <w:noWrap w:val="false"/>
           </w:tcPr>
@@ -2708,7 +2746,7 @@
                 <w:b w:val="0"/>
                 <w:sz w:val="18"/>
               </w:rPr>
-              <w:t xml:space="preserve">Tm суммарный — средний период</w:t>
+              <w:t xml:space="preserve">Tm суммарный средний период</w:t>
             </w:r>
             <w:r/>
           </w:p>
@@ -2716,7 +2754,7 @@
         <w:tc>
           <w:tcPr>
             <w:tcBorders/>
-            <w:tcW w:w="850" w:type="dxa"/>
+            <w:tcW w:w="992" w:type="dxa"/>
             <w:textDirection w:val="lrTb"/>
             <w:noWrap w:val="false"/>
           </w:tcPr>
@@ -2741,7 +2779,7 @@
         <w:tc>
           <w:tcPr>
             <w:tcBorders/>
-            <w:tcW w:w="992" w:type="dxa"/>
+            <w:tcW w:w="1134" w:type="dxa"/>
             <w:textDirection w:val="lrTb"/>
             <w:noWrap w:val="false"/>
           </w:tcPr>
@@ -2791,7 +2829,7 @@
         <w:tc>
           <w:tcPr>
             <w:tcBorders/>
-            <w:tcW w:w="2994" w:type="dxa"/>
+            <w:tcW w:w="3135" w:type="dxa"/>
             <w:textDirection w:val="lrTb"/>
             <w:noWrap w:val="false"/>
           </w:tcPr>
@@ -2898,7 +2936,7 @@
           <w:tcPr>
             <w:shd w:val="clear" w:color="auto" w:fill="f2f2f2"/>
             <w:tcBorders/>
-            <w:tcW w:w="1843" w:type="dxa"/>
+            <w:tcW w:w="1417" w:type="dxa"/>
             <w:textDirection w:val="lrTb"/>
             <w:noWrap w:val="false"/>
           </w:tcPr>
@@ -2915,7 +2953,24 @@
                 <w:b w:val="0"/>
                 <w:sz w:val="18"/>
               </w:rPr>
-              <w:t xml:space="preserve">Dp суммарный — пиковое направление</w:t>
+              <w:t xml:space="preserve">Dp суммарн</w:t>
+            </w:r>
+            <w:r>
+              <w:rPr>
+                <w:rFonts w:ascii="Arial" w:hAnsi="Arial"/>
+                <w:b w:val="0"/>
+                <w:sz w:val="18"/>
+                <w:lang w:val="ru-RU"/>
+              </w:rPr>
+              <w:t xml:space="preserve">ое</w:t>
+            </w:r>
+            <w:r>
+              <w:rPr>
+                <w:rFonts w:ascii="Arial" w:hAnsi="Arial"/>
+                <w:b w:val="0"/>
+                <w:sz w:val="18"/>
+              </w:rPr>
+              <w:t xml:space="preserve"> пиковое направление</w:t>
             </w:r>
             <w:r/>
           </w:p>
@@ -2924,7 +2979,7 @@
           <w:tcPr>
             <w:shd w:val="clear" w:color="auto" w:fill="f2f2f2"/>
             <w:tcBorders/>
-            <w:tcW w:w="850" w:type="dxa"/>
+            <w:tcW w:w="992" w:type="dxa"/>
             <w:textDirection w:val="lrTb"/>
             <w:noWrap w:val="false"/>
           </w:tcPr>
@@ -2950,7 +3005,7 @@
           <w:tcPr>
             <w:shd w:val="clear" w:color="auto" w:fill="f2f2f2"/>
             <w:tcBorders/>
-            <w:tcW w:w="992" w:type="dxa"/>
+            <w:tcW w:w="1134" w:type="dxa"/>
             <w:textDirection w:val="lrTb"/>
             <w:noWrap w:val="false"/>
           </w:tcPr>
@@ -3002,7 +3057,7 @@
           <w:tcPr>
             <w:shd w:val="clear" w:color="auto" w:fill="f2f2f2"/>
             <w:tcBorders/>
-            <w:tcW w:w="2994" w:type="dxa"/>
+            <w:tcW w:w="3135" w:type="dxa"/>
             <w:textDirection w:val="lrTb"/>
             <w:noWrap w:val="false"/>
           </w:tcPr>
@@ -3131,7 +3186,7 @@
         <w:tc>
           <w:tcPr>
             <w:tcBorders/>
-            <w:tcW w:w="1843" w:type="dxa"/>
+            <w:tcW w:w="1417" w:type="dxa"/>
             <w:textDirection w:val="lrTb"/>
             <w:noWrap w:val="false"/>
           </w:tcPr>
@@ -3148,7 +3203,33 @@
                 <w:b w:val="0"/>
                 <w:sz w:val="18"/>
               </w:rPr>
-              <w:t xml:space="preserve">Dm суммарный — среднее направление</w:t>
+              <w:t xml:space="preserve">Dm суммарн</w:t>
+            </w:r>
+            <w:r>
+              <w:rPr>
+                <w:rFonts w:ascii="Arial" w:hAnsi="Arial"/>
+                <w:b w:val="0"/>
+                <w:sz w:val="18"/>
+                <w:lang w:val="ru-RU"/>
+              </w:rPr>
+              <w:t xml:space="preserve">ое</w:t>
+            </w:r>
+            <w:r>
+              <w:rPr>
+                <w:rFonts w:ascii="Arial" w:hAnsi="Arial"/>
+                <w:b w:val="0"/>
+                <w:sz w:val="18"/>
+                <w:lang w:val="ru-RU"/>
+              </w:rPr>
+              <w:t xml:space="preserve"> </w:t>
+            </w:r>
+            <w:r>
+              <w:rPr>
+                <w:rFonts w:ascii="Arial" w:hAnsi="Arial"/>
+                <w:b w:val="0"/>
+                <w:sz w:val="18"/>
+              </w:rPr>
+              <w:t xml:space="preserve">среднее направление</w:t>
             </w:r>
             <w:r/>
           </w:p>
@@ -3156,7 +3237,7 @@
         <w:tc>
           <w:tcPr>
             <w:tcBorders/>
-            <w:tcW w:w="850" w:type="dxa"/>
+            <w:tcW w:w="992" w:type="dxa"/>
             <w:textDirection w:val="lrTb"/>
             <w:noWrap w:val="false"/>
           </w:tcPr>
@@ -3181,7 +3262,7 @@
         <w:tc>
           <w:tcPr>
             <w:tcBorders/>
-            <w:tcW w:w="992" w:type="dxa"/>
+            <w:tcW w:w="1134" w:type="dxa"/>
             <w:textDirection w:val="lrTb"/>
             <w:noWrap w:val="false"/>
           </w:tcPr>
@@ -3231,7 +3312,7 @@
         <w:tc>
           <w:tcPr>
             <w:tcBorders/>
-            <w:tcW w:w="2994" w:type="dxa"/>
+            <w:tcW w:w="3135" w:type="dxa"/>
             <w:textDirection w:val="lrTb"/>
             <w:noWrap w:val="false"/>
           </w:tcPr>
@@ -3338,7 +3419,7 @@
           <w:tcPr>
             <w:shd w:val="clear" w:color="auto" w:fill="f2f2f2"/>
             <w:tcBorders/>
-            <w:tcW w:w="1843" w:type="dxa"/>
+            <w:tcW w:w="1417" w:type="dxa"/>
             <w:textDirection w:val="lrTb"/>
             <w:noWrap w:val="false"/>
           </w:tcPr>
@@ -3364,7 +3445,7 @@
           <w:tcPr>
             <w:shd w:val="clear" w:color="auto" w:fill="f2f2f2"/>
             <w:tcBorders/>
-            <w:tcW w:w="850" w:type="dxa"/>
+            <w:tcW w:w="992" w:type="dxa"/>
             <w:textDirection w:val="lrTb"/>
             <w:noWrap w:val="false"/>
           </w:tcPr>
@@ -3390,7 +3471,7 @@
           <w:tcPr>
             <w:shd w:val="clear" w:color="auto" w:fill="f2f2f2"/>
             <w:tcBorders/>
-            <w:tcW w:w="992" w:type="dxa"/>
+            <w:tcW w:w="1134" w:type="dxa"/>
             <w:textDirection w:val="lrTb"/>
             <w:noWrap w:val="false"/>
           </w:tcPr>
@@ -3442,7 +3523,7 @@
           <w:tcPr>
             <w:shd w:val="clear" w:color="auto" w:fill="f2f2f2"/>
             <w:tcBorders/>
-            <w:tcW w:w="2994" w:type="dxa"/>
+            <w:tcW w:w="3135" w:type="dxa"/>
             <w:textDirection w:val="lrTb"/>
             <w:noWrap w:val="false"/>
           </w:tcPr>
@@ -3545,7 +3626,7 @@
         <w:tc>
           <w:tcPr>
             <w:tcBorders/>
-            <w:tcW w:w="1843" w:type="dxa"/>
+            <w:tcW w:w="1417" w:type="dxa"/>
             <w:textDirection w:val="lrTb"/>
             <w:noWrap w:val="false"/>
           </w:tcPr>
@@ -3570,7 +3651,7 @@
         <w:tc>
           <w:tcPr>
             <w:tcBorders/>
-            <w:tcW w:w="850" w:type="dxa"/>
+            <w:tcW w:w="992" w:type="dxa"/>
             <w:textDirection w:val="lrTb"/>
             <w:noWrap w:val="false"/>
           </w:tcPr>
@@ -3595,7 +3676,7 @@
         <w:tc>
           <w:tcPr>
             <w:tcBorders/>
-            <w:tcW w:w="992" w:type="dxa"/>
+            <w:tcW w:w="1134" w:type="dxa"/>
             <w:textDirection w:val="lrTb"/>
             <w:noWrap w:val="false"/>
           </w:tcPr>
@@ -3645,7 +3726,7 @@
         <w:tc>
           <w:tcPr>
             <w:tcBorders/>
-            <w:tcW w:w="2994" w:type="dxa"/>
+            <w:tcW w:w="3135" w:type="dxa"/>
             <w:textDirection w:val="lrTb"/>
             <w:noWrap w:val="false"/>
           </w:tcPr>
@@ -3761,7 +3842,7 @@
           <w:tcPr>
             <w:shd w:val="clear" w:color="auto" w:fill="f2f2f2"/>
             <w:tcBorders/>
-            <w:tcW w:w="1843" w:type="dxa"/>
+            <w:tcW w:w="1417" w:type="dxa"/>
             <w:textDirection w:val="lrTb"/>
             <w:noWrap w:val="false"/>
           </w:tcPr>
@@ -3787,7 +3868,7 @@
           <w:tcPr>
             <w:shd w:val="clear" w:color="auto" w:fill="f2f2f2"/>
             <w:tcBorders/>
-            <w:tcW w:w="850" w:type="dxa"/>
+            <w:tcW w:w="992" w:type="dxa"/>
             <w:textDirection w:val="lrTb"/>
             <w:noWrap w:val="false"/>
           </w:tcPr>
@@ -3813,7 +3894,7 @@
           <w:tcPr>
             <w:shd w:val="clear" w:color="auto" w:fill="f2f2f2"/>
             <w:tcBorders/>
-            <w:tcW w:w="992" w:type="dxa"/>
+            <w:tcW w:w="1134" w:type="dxa"/>
             <w:textDirection w:val="lrTb"/>
             <w:noWrap w:val="false"/>
           </w:tcPr>
@@ -3865,7 +3946,7 @@
           <w:tcPr>
             <w:shd w:val="clear" w:color="auto" w:fill="f2f2f2"/>
             <w:tcBorders/>
-            <w:tcW w:w="2994" w:type="dxa"/>
+            <w:tcW w:w="3135" w:type="dxa"/>
             <w:textDirection w:val="lrTb"/>
             <w:noWrap w:val="false"/>
           </w:tcPr>
@@ -3986,7 +4067,7 @@
         <w:tc>
           <w:tcPr>
             <w:tcBorders/>
-            <w:tcW w:w="1843" w:type="dxa"/>
+            <w:tcW w:w="1417" w:type="dxa"/>
             <w:textDirection w:val="lrTb"/>
             <w:noWrap w:val="false"/>
           </w:tcPr>
@@ -4011,7 +4092,7 @@
         <w:tc>
           <w:tcPr>
             <w:tcBorders/>
-            <w:tcW w:w="850" w:type="dxa"/>
+            <w:tcW w:w="992" w:type="dxa"/>
             <w:textDirection w:val="lrTb"/>
             <w:noWrap w:val="false"/>
           </w:tcPr>
@@ -4036,7 +4117,7 @@
         <w:tc>
           <w:tcPr>
             <w:tcBorders/>
-            <w:tcW w:w="992" w:type="dxa"/>
+            <w:tcW w:w="1134" w:type="dxa"/>
             <w:textDirection w:val="lrTb"/>
             <w:noWrap w:val="false"/>
           </w:tcPr>
@@ -4086,7 +4167,7 @@
         <w:tc>
           <w:tcPr>
             <w:tcBorders/>
-            <w:tcW w:w="2994" w:type="dxa"/>
+            <w:tcW w:w="3135" w:type="dxa"/>
             <w:textDirection w:val="lrTb"/>
             <w:noWrap w:val="false"/>
           </w:tcPr>
@@ -4193,7 +4274,7 @@
           <w:tcPr>
             <w:shd w:val="clear" w:color="auto" w:fill="f2f2f2"/>
             <w:tcBorders/>
-            <w:tcW w:w="1843" w:type="dxa"/>
+            <w:tcW w:w="1417" w:type="dxa"/>
             <w:textDirection w:val="lrTb"/>
             <w:noWrap w:val="false"/>
           </w:tcPr>
@@ -4219,7 +4300,7 @@
           <w:tcPr>
             <w:shd w:val="clear" w:color="auto" w:fill="f2f2f2"/>
             <w:tcBorders/>
-            <w:tcW w:w="850" w:type="dxa"/>
+            <w:tcW w:w="992" w:type="dxa"/>
             <w:textDirection w:val="lrTb"/>
             <w:noWrap w:val="false"/>
           </w:tcPr>
@@ -4245,7 +4326,7 @@
           <w:tcPr>
             <w:shd w:val="clear" w:color="auto" w:fill="f2f2f2"/>
             <w:tcBorders/>
-            <w:tcW w:w="992" w:type="dxa"/>
+            <w:tcW w:w="1134" w:type="dxa"/>
             <w:textDirection w:val="lrTb"/>
             <w:noWrap w:val="false"/>
           </w:tcPr>
@@ -4297,7 +4378,7 @@
           <w:tcPr>
             <w:shd w:val="clear" w:color="auto" w:fill="f2f2f2"/>
             <w:tcBorders/>
-            <w:tcW w:w="2994" w:type="dxa"/>
+            <w:tcW w:w="3135" w:type="dxa"/>
             <w:textDirection w:val="lrTb"/>
             <w:noWrap w:val="false"/>
           </w:tcPr>
@@ -4409,7 +4490,7 @@
         <w:tc>
           <w:tcPr>
             <w:tcBorders/>
-            <w:tcW w:w="1843" w:type="dxa"/>
+            <w:tcW w:w="1417" w:type="dxa"/>
             <w:textDirection w:val="lrTb"/>
             <w:noWrap w:val="false"/>
           </w:tcPr>
@@ -4434,7 +4515,7 @@
         <w:tc>
           <w:tcPr>
             <w:tcBorders/>
-            <w:tcW w:w="850" w:type="dxa"/>
+            <w:tcW w:w="992" w:type="dxa"/>
             <w:textDirection w:val="lrTb"/>
             <w:noWrap w:val="false"/>
           </w:tcPr>
@@ -4459,7 +4540,7 @@
         <w:tc>
           <w:tcPr>
             <w:tcBorders/>
-            <w:tcW w:w="992" w:type="dxa"/>
+            <w:tcW w:w="1134" w:type="dxa"/>
             <w:textDirection w:val="lrTb"/>
             <w:noWrap w:val="false"/>
           </w:tcPr>
@@ -4509,7 +4590,7 @@
         <w:tc>
           <w:tcPr>
             <w:tcBorders/>
-            <w:tcW w:w="2994" w:type="dxa"/>
+            <w:tcW w:w="3135" w:type="dxa"/>
             <w:textDirection w:val="lrTb"/>
             <w:noWrap w:val="false"/>
           </w:tcPr>
@@ -4634,7 +4715,7 @@
           <w:tcPr>
             <w:shd w:val="clear" w:color="auto" w:fill="f2f2f2"/>
             <w:tcBorders/>
-            <w:tcW w:w="1843" w:type="dxa"/>
+            <w:tcW w:w="1417" w:type="dxa"/>
             <w:textDirection w:val="lrTb"/>
             <w:noWrap w:val="false"/>
           </w:tcPr>
@@ -4660,7 +4741,7 @@
           <w:tcPr>
             <w:shd w:val="clear" w:color="auto" w:fill="f2f2f2"/>
             <w:tcBorders/>
-            <w:tcW w:w="850" w:type="dxa"/>
+            <w:tcW w:w="992" w:type="dxa"/>
             <w:textDirection w:val="lrTb"/>
             <w:noWrap w:val="false"/>
           </w:tcPr>
@@ -4686,7 +4767,7 @@
           <w:tcPr>
             <w:shd w:val="clear" w:color="auto" w:fill="f2f2f2"/>
             <w:tcBorders/>
-            <w:tcW w:w="992" w:type="dxa"/>
+            <w:tcW w:w="1134" w:type="dxa"/>
             <w:textDirection w:val="lrTb"/>
             <w:noWrap w:val="false"/>
           </w:tcPr>
@@ -4738,7 +4819,7 @@
           <w:tcPr>
             <w:shd w:val="clear" w:color="auto" w:fill="f2f2f2"/>
             <w:tcBorders/>
-            <w:tcW w:w="2994" w:type="dxa"/>
+            <w:tcW w:w="3135" w:type="dxa"/>
             <w:textDirection w:val="lrTb"/>
             <w:noWrap w:val="false"/>
           </w:tcPr>
@@ -4841,7 +4922,7 @@
         <w:tc>
           <w:tcPr>
             <w:tcBorders/>
-            <w:tcW w:w="1843" w:type="dxa"/>
+            <w:tcW w:w="1417" w:type="dxa"/>
             <w:textDirection w:val="lrTb"/>
             <w:noWrap w:val="false"/>
           </w:tcPr>
@@ -4866,7 +4947,7 @@
         <w:tc>
           <w:tcPr>
             <w:tcBorders/>
-            <w:tcW w:w="850" w:type="dxa"/>
+            <w:tcW w:w="992" w:type="dxa"/>
             <w:textDirection w:val="lrTb"/>
             <w:noWrap w:val="false"/>
           </w:tcPr>
@@ -4891,7 +4972,7 @@
         <w:tc>
           <w:tcPr>
             <w:tcBorders/>
-            <w:tcW w:w="992" w:type="dxa"/>
+            <w:tcW w:w="1134" w:type="dxa"/>
             <w:textDirection w:val="lrTb"/>
             <w:noWrap w:val="false"/>
           </w:tcPr>
@@ -4941,7 +5022,7 @@
         <w:tc>
           <w:tcPr>
             <w:tcBorders/>
-            <w:tcW w:w="2994" w:type="dxa"/>
+            <w:tcW w:w="3135" w:type="dxa"/>
             <w:textDirection w:val="lrTb"/>
             <w:noWrap w:val="false"/>
           </w:tcPr>
@@ -5057,7 +5138,7 @@
           <w:tcPr>
             <w:shd w:val="clear" w:color="auto" w:fill="f2f2f2"/>
             <w:tcBorders/>
-            <w:tcW w:w="1843" w:type="dxa"/>
+            <w:tcW w:w="1417" w:type="dxa"/>
             <w:textDirection w:val="lrTb"/>
             <w:noWrap w:val="false"/>
           </w:tcPr>
@@ -5083,7 +5164,7 @@
           <w:tcPr>
             <w:shd w:val="clear" w:color="auto" w:fill="f2f2f2"/>
             <w:tcBorders/>
-            <w:tcW w:w="850" w:type="dxa"/>
+            <w:tcW w:w="992" w:type="dxa"/>
             <w:textDirection w:val="lrTb"/>
             <w:noWrap w:val="false"/>
           </w:tcPr>
@@ -5109,7 +5190,7 @@
           <w:tcPr>
             <w:shd w:val="clear" w:color="auto" w:fill="f2f2f2"/>
             <w:tcBorders/>
-            <w:tcW w:w="992" w:type="dxa"/>
+            <w:tcW w:w="1134" w:type="dxa"/>
             <w:textDirection w:val="lrTb"/>
             <w:noWrap w:val="false"/>
           </w:tcPr>
@@ -5161,7 +5242,7 @@
           <w:tcPr>
             <w:shd w:val="clear" w:color="auto" w:fill="f2f2f2"/>
             <w:tcBorders/>
-            <w:tcW w:w="2994" w:type="dxa"/>
+            <w:tcW w:w="3135" w:type="dxa"/>
             <w:textDirection w:val="lrTb"/>
             <w:noWrap w:val="false"/>
           </w:tcPr>
@@ -5282,7 +5363,7 @@
         <w:tc>
           <w:tcPr>
             <w:tcBorders/>
-            <w:tcW w:w="1843" w:type="dxa"/>
+            <w:tcW w:w="1417" w:type="dxa"/>
             <w:textDirection w:val="lrTb"/>
             <w:noWrap w:val="false"/>
           </w:tcPr>
@@ -5307,7 +5388,7 @@
         <w:tc>
           <w:tcPr>
             <w:tcBorders/>
-            <w:tcW w:w="850" w:type="dxa"/>
+            <w:tcW w:w="992" w:type="dxa"/>
             <w:textDirection w:val="lrTb"/>
             <w:noWrap w:val="false"/>
           </w:tcPr>
@@ -5332,7 +5413,7 @@
         <w:tc>
           <w:tcPr>
             <w:tcBorders/>
-            <w:tcW w:w="992" w:type="dxa"/>
+            <w:tcW w:w="1134" w:type="dxa"/>
             <w:textDirection w:val="lrTb"/>
             <w:noWrap w:val="false"/>
           </w:tcPr>
@@ -5382,7 +5463,7 @@
         <w:tc>
           <w:tcPr>
             <w:tcBorders/>
-            <w:tcW w:w="2994" w:type="dxa"/>
+            <w:tcW w:w="3135" w:type="dxa"/>
             <w:textDirection w:val="lrTb"/>
             <w:noWrap w:val="false"/>
           </w:tcPr>
@@ -5515,7 +5596,7 @@
           <w:tcPr>
             <w:shd w:val="clear" w:color="auto" w:fill="f2f2f2"/>
             <w:tcBorders/>
-            <w:tcW w:w="1843" w:type="dxa"/>
+            <w:tcW w:w="1417" w:type="dxa"/>
             <w:textDirection w:val="lrTb"/>
             <w:noWrap w:val="false"/>
           </w:tcPr>
@@ -5541,7 +5622,7 @@
           <w:tcPr>
             <w:shd w:val="clear" w:color="auto" w:fill="f2f2f2"/>
             <w:tcBorders/>
-            <w:tcW w:w="850" w:type="dxa"/>
+            <w:tcW w:w="992" w:type="dxa"/>
             <w:textDirection w:val="lrTb"/>
             <w:noWrap w:val="false"/>
           </w:tcPr>
@@ -5567,7 +5648,7 @@
           <w:tcPr>
             <w:shd w:val="clear" w:color="auto" w:fill="f2f2f2"/>
             <w:tcBorders/>
-            <w:tcW w:w="992" w:type="dxa"/>
+            <w:tcW w:w="1134" w:type="dxa"/>
             <w:textDirection w:val="lrTb"/>
             <w:noWrap w:val="false"/>
           </w:tcPr>
@@ -5619,7 +5700,7 @@
           <w:tcPr>
             <w:shd w:val="clear" w:color="auto" w:fill="f2f2f2"/>
             <w:tcBorders/>
-            <w:tcW w:w="2994" w:type="dxa"/>
+            <w:tcW w:w="3135" w:type="dxa"/>
             <w:textDirection w:val="lrTb"/>
             <w:noWrap w:val="false"/>
           </w:tcPr>
@@ -5739,7 +5820,7 @@
         <w:tc>
           <w:tcPr>
             <w:tcBorders/>
-            <w:tcW w:w="1843" w:type="dxa"/>
+            <w:tcW w:w="1417" w:type="dxa"/>
             <w:textDirection w:val="lrTb"/>
             <w:noWrap w:val="false"/>
           </w:tcPr>
@@ -5764,7 +5845,7 @@
         <w:tc>
           <w:tcPr>
             <w:tcBorders/>
-            <w:tcW w:w="850" w:type="dxa"/>
+            <w:tcW w:w="992" w:type="dxa"/>
             <w:textDirection w:val="lrTb"/>
             <w:noWrap w:val="false"/>
           </w:tcPr>
@@ -5789,7 +5870,7 @@
         <w:tc>
           <w:tcPr>
             <w:tcBorders/>
-            <w:tcW w:w="992" w:type="dxa"/>
+            <w:tcW w:w="1134" w:type="dxa"/>
             <w:textDirection w:val="lrTb"/>
             <w:noWrap w:val="false"/>
           </w:tcPr>
@@ -5839,7 +5920,7 @@
         <w:tc>
           <w:tcPr>
             <w:tcBorders/>
-            <w:tcW w:w="2994" w:type="dxa"/>
+            <w:tcW w:w="3135" w:type="dxa"/>
             <w:textDirection w:val="lrTb"/>
             <w:noWrap w:val="false"/>
           </w:tcPr>
@@ -5974,7 +6055,7 @@
           <w:tcPr>
             <w:shd w:val="clear" w:color="auto" w:fill="f2f2f2"/>
             <w:tcBorders/>
-            <w:tcW w:w="1843" w:type="dxa"/>
+            <w:tcW w:w="1417" w:type="dxa"/>
             <w:textDirection w:val="lrTb"/>
             <w:noWrap w:val="false"/>
           </w:tcPr>
@@ -6000,7 +6081,7 @@
           <w:tcPr>
             <w:shd w:val="clear" w:color="auto" w:fill="f2f2f2"/>
             <w:tcBorders/>
-            <w:tcW w:w="850" w:type="dxa"/>
+            <w:tcW w:w="992" w:type="dxa"/>
             <w:textDirection w:val="lrTb"/>
             <w:noWrap w:val="false"/>
           </w:tcPr>
@@ -6026,7 +6107,7 @@
           <w:tcPr>
             <w:shd w:val="clear" w:color="auto" w:fill="f2f2f2"/>
             <w:tcBorders/>
-            <w:tcW w:w="992" w:type="dxa"/>
+            <w:tcW w:w="1134" w:type="dxa"/>
             <w:textDirection w:val="lrTb"/>
             <w:noWrap w:val="false"/>
           </w:tcPr>
@@ -6078,7 +6159,7 @@
           <w:tcPr>
             <w:shd w:val="clear" w:color="auto" w:fill="f2f2f2"/>
             <w:tcBorders/>
-            <w:tcW w:w="2994" w:type="dxa"/>
+            <w:tcW w:w="3135" w:type="dxa"/>
             <w:textDirection w:val="lrTb"/>
             <w:noWrap w:val="false"/>
           </w:tcPr>
@@ -6190,7 +6271,7 @@
         <w:tc>
           <w:tcPr>
             <w:tcBorders/>
-            <w:tcW w:w="1843" w:type="dxa"/>
+            <w:tcW w:w="1417" w:type="dxa"/>
             <w:textDirection w:val="lrTb"/>
             <w:noWrap w:val="false"/>
           </w:tcPr>
@@ -6215,7 +6296,7 @@
         <w:tc>
           <w:tcPr>
             <w:tcBorders/>
-            <w:tcW w:w="850" w:type="dxa"/>
+            <w:tcW w:w="992" w:type="dxa"/>
             <w:textDirection w:val="lrTb"/>
             <w:noWrap w:val="false"/>
           </w:tcPr>
@@ -6240,7 +6321,7 @@
         <w:tc>
           <w:tcPr>
             <w:tcBorders/>
-            <w:tcW w:w="992" w:type="dxa"/>
+            <w:tcW w:w="1134" w:type="dxa"/>
             <w:textDirection w:val="lrTb"/>
             <w:noWrap w:val="false"/>
           </w:tcPr>
@@ -6290,7 +6371,7 @@
         <w:tc>
           <w:tcPr>
             <w:tcBorders/>
-            <w:tcW w:w="2994" w:type="dxa"/>
+            <w:tcW w:w="3135" w:type="dxa"/>
             <w:textDirection w:val="lrTb"/>
             <w:noWrap w:val="false"/>
           </w:tcPr>
@@ -6397,7 +6478,7 @@
           <w:tcPr>
             <w:shd w:val="clear" w:color="auto" w:fill="f2f2f2"/>
             <w:tcBorders/>
-            <w:tcW w:w="1843" w:type="dxa"/>
+            <w:tcW w:w="1417" w:type="dxa"/>
             <w:textDirection w:val="lrTb"/>
             <w:noWrap w:val="false"/>
           </w:tcPr>
@@ -6423,7 +6504,7 @@
           <w:tcPr>
             <w:shd w:val="clear" w:color="auto" w:fill="f2f2f2"/>
             <w:tcBorders/>
-            <w:tcW w:w="850" w:type="dxa"/>
+            <w:tcW w:w="992" w:type="dxa"/>
             <w:textDirection w:val="lrTb"/>
             <w:noWrap w:val="false"/>
           </w:tcPr>
@@ -6449,7 +6530,7 @@
           <w:tcPr>
             <w:shd w:val="clear" w:color="auto" w:fill="f2f2f2"/>
             <w:tcBorders/>
-            <w:tcW w:w="992" w:type="dxa"/>
+            <w:tcW w:w="1134" w:type="dxa"/>
             <w:textDirection w:val="lrTb"/>
             <w:noWrap w:val="false"/>
           </w:tcPr>
@@ -6501,7 +6582,7 @@
           <w:tcPr>
             <w:shd w:val="clear" w:color="auto" w:fill="f2f2f2"/>
             <w:tcBorders/>
-            <w:tcW w:w="2994" w:type="dxa"/>
+            <w:tcW w:w="3135" w:type="dxa"/>
             <w:textDirection w:val="lrTb"/>
             <w:noWrap w:val="false"/>
           </w:tcPr>
@@ -6604,7 +6685,7 @@
         <w:tc>
           <w:tcPr>
             <w:tcBorders/>
-            <w:tcW w:w="1843" w:type="dxa"/>
+            <w:tcW w:w="1417" w:type="dxa"/>
             <w:textDirection w:val="lrTb"/>
             <w:noWrap w:val="false"/>
           </w:tcPr>
@@ -6629,7 +6710,7 @@
         <w:tc>
           <w:tcPr>
             <w:tcBorders/>
-            <w:tcW w:w="850" w:type="dxa"/>
+            <w:tcW w:w="992" w:type="dxa"/>
             <w:textDirection w:val="lrTb"/>
             <w:noWrap w:val="false"/>
           </w:tcPr>
@@ -6654,7 +6735,7 @@
         <w:tc>
           <w:tcPr>
             <w:tcBorders/>
-            <w:tcW w:w="992" w:type="dxa"/>
+            <w:tcW w:w="1134" w:type="dxa"/>
             <w:textDirection w:val="lrTb"/>
             <w:noWrap w:val="false"/>
           </w:tcPr>
@@ -6704,7 +6785,7 @@
         <w:tc>
           <w:tcPr>
             <w:tcBorders/>
-            <w:tcW w:w="2994" w:type="dxa"/>
+            <w:tcW w:w="3135" w:type="dxa"/>
             <w:textDirection w:val="lrTb"/>
             <w:noWrap w:val="false"/>
           </w:tcPr>
@@ -6807,7 +6888,7 @@
         <w:tc>
           <w:tcPr>
             <w:tcBorders/>
-            <w:tcW w:w="1843" w:type="dxa"/>
+            <w:tcW w:w="1417" w:type="dxa"/>
             <w:textDirection w:val="lrTb"/>
             <w:noWrap w:val="false"/>
           </w:tcPr>
@@ -6823,8 +6904,9 @@
                 <w:rFonts w:ascii="Arial" w:hAnsi="Arial"/>
                 <w:b w:val="0"/>
                 <w:sz w:val="18"/>
+                <w:lang w:val="ru-RU"/>
               </w:rPr>
-              <w:t xml:space="preserve">Зарезервировано</w:t>
+              <w:t xml:space="preserve">Резерв</w:t>
             </w:r>
             <w:r/>
           </w:p>
@@ -6832,7 +6914,7 @@
         <w:tc>
           <w:tcPr>
             <w:tcBorders/>
-            <w:tcW w:w="850" w:type="dxa"/>
+            <w:tcW w:w="992" w:type="dxa"/>
             <w:textDirection w:val="lrTb"/>
             <w:noWrap w:val="false"/>
           </w:tcPr>
@@ -6857,7 +6939,7 @@
         <w:tc>
           <w:tcPr>
             <w:tcBorders/>
-            <w:tcW w:w="992" w:type="dxa"/>
+            <w:tcW w:w="1134" w:type="dxa"/>
             <w:textDirection w:val="lrTb"/>
             <w:noWrap w:val="false"/>
           </w:tcPr>
@@ -6907,7 +6989,7 @@
         <w:tc>
           <w:tcPr>
             <w:tcBorders/>
-            <w:tcW w:w="2994" w:type="dxa"/>
+            <w:tcW w:w="3135" w:type="dxa"/>
             <w:textDirection w:val="lrTb"/>
             <w:noWrap w:val="false"/>
           </w:tcPr>
@@ -6937,7 +7019,10 @@
         <w:pBdr/>
         <w:spacing/>
         <w:ind/>
-        <w:rPr/>
+        <w:rPr>
+          <w:rFonts w:ascii="Arial" w:hAnsi="Arial"/>
+          <w:highlight w:val="none"/>
+        </w:rPr>
       </w:pPr>
       <w:r>
         <w:rPr>

</xml_diff>